<commit_message>
Lit Review continued. Project Plan and Risk analysis continued.
</commit_message>
<xml_diff>
--- a/Project Plan & Risk Analysis.docx
+++ b/Project Plan & Risk Analysis.docx
@@ -300,13 +300,7 @@
           </w:tcPr>
           <w:p>
             <w:r>
-              <w:t>Further</w:t>
-            </w:r>
-            <w:r>
-              <w:t>,</w:t>
-            </w:r>
-            <w:r>
-              <w:t xml:space="preserve"> Lit Review Topics Defined.</w:t>
+              <w:t>Topics Defined.</w:t>
             </w:r>
           </w:p>
           <w:p>
@@ -321,7 +315,12 @@
           </w:tcPr>
           <w:p>
             <w:r>
-              <w:t>In Progress</w:t>
+              <w:t>Done</w:t>
+            </w:r>
+          </w:p>
+          <w:p>
+            <w:r>
+              <w:t>Done</w:t>
             </w:r>
           </w:p>
         </w:tc>
@@ -384,7 +383,12 @@
           </w:tcPr>
           <w:p>
             <w:r>
-              <w:t>In Progress</w:t>
+              <w:t>Done</w:t>
+            </w:r>
+          </w:p>
+          <w:p>
+            <w:r>
+              <w:t>Done</w:t>
             </w:r>
           </w:p>
         </w:tc>
@@ -412,13 +416,18 @@
           </w:tcPr>
           <w:p>
             <w:r>
-              <w:t>Project Specification</w:t>
-            </w:r>
-            <w:r>
-              <w:t>:</w:t>
-            </w:r>
-            <w:r>
-              <w:t xml:space="preserve"> </w:t>
+              <w:t xml:space="preserve">Project Specification: </w:t>
+            </w:r>
+          </w:p>
+          <w:p>
+            <w:r>
+              <w:t xml:space="preserve">Management Software </w:t>
+            </w:r>
+            <w:r>
+              <w:t>Setup (</w:t>
+            </w:r>
+            <w:r>
+              <w:t>2)</w:t>
             </w:r>
           </w:p>
           <w:p>
@@ -428,24 +437,12 @@
           </w:p>
           <w:p>
             <w:r>
-              <w:t xml:space="preserve">User Requirements </w:t>
-            </w:r>
-            <w:r>
-              <w:t>started. (</w:t>
-            </w:r>
-            <w:r>
-              <w:t>2)</w:t>
-            </w:r>
-          </w:p>
-          <w:p>
-            <w:r>
-              <w:t xml:space="preserve">Start Product </w:t>
-            </w:r>
-            <w:r>
-              <w:t>Backlog. (</w:t>
-            </w:r>
-            <w:r>
-              <w:t>2)</w:t>
+              <w:t>User Requirements started. (2)</w:t>
+            </w:r>
+          </w:p>
+          <w:p>
+            <w:r>
+              <w:t>Start Product Backlog. (2)</w:t>
             </w:r>
           </w:p>
         </w:tc>
@@ -455,10 +452,7 @@
           </w:tcPr>
           <w:p>
             <w:r>
-              <w:t>Project Spec Outline</w:t>
-            </w:r>
-            <w:r>
-              <w:t>.</w:t>
+              <w:t>Project Spec Outline.</w:t>
             </w:r>
           </w:p>
           <w:p>
@@ -468,6 +462,11 @@
           </w:p>
           <w:p>
             <w:r>
+              <w:t>Management software.</w:t>
+            </w:r>
+          </w:p>
+          <w:p>
+            <w:r>
               <w:t>User Requirements start.</w:t>
             </w:r>
           </w:p>
@@ -506,7 +505,17 @@
           <w:tcPr>
             <w:tcW w:w="2835" w:type="dxa"/>
           </w:tcPr>
-          <w:p/>
+          <w:p>
+            <w:r>
+              <w:t xml:space="preserve">Chosen Jira, </w:t>
+            </w:r>
+            <w:r>
+              <w:t>and </w:t>
+            </w:r>
+            <w:r>
+              <w:t>started to set up already.</w:t>
+            </w:r>
+          </w:p>
         </w:tc>
       </w:tr>
       <w:tr>
@@ -526,24 +535,12 @@
           </w:tcPr>
           <w:p>
             <w:r>
-              <w:t>Project Specification</w:t>
-            </w:r>
-            <w:r>
-              <w:t>:</w:t>
-            </w:r>
-          </w:p>
-          <w:p>
-            <w:r>
-              <w:t xml:space="preserve">User Requirements </w:t>
-            </w:r>
-            <w:r>
-              <w:t>Defined. (</w:t>
-            </w:r>
-            <w:r>
-              <w:t>4</w:t>
-            </w:r>
-            <w:r>
-              <w:t>)</w:t>
+              <w:t>Project Specification:</w:t>
+            </w:r>
+          </w:p>
+          <w:p>
+            <w:r>
+              <w:t>User Requirements Defined. (4)</w:t>
             </w:r>
           </w:p>
           <w:p>
@@ -553,13 +550,7 @@
           </w:p>
           <w:p>
             <w:r>
-              <w:t>Defined. (</w:t>
-            </w:r>
-            <w:r>
-              <w:t>2</w:t>
-            </w:r>
-            <w:r>
-              <w:t>)</w:t>
+              <w:t>Defined. (2)</w:t>
             </w:r>
           </w:p>
         </w:tc>
@@ -621,7 +612,7 @@
               <w:t>Design</w:t>
             </w:r>
             <w:r>
-              <w:t xml:space="preserve"> Phase Documents (6)</w:t>
+              <w:t xml:space="preserve"> Phase Documents (6):</w:t>
             </w:r>
           </w:p>
         </w:tc>
@@ -672,7 +663,7 @@
               <w:t>Design</w:t>
             </w:r>
             <w:r>
-              <w:t xml:space="preserve"> Phase Documents (6)</w:t>
+              <w:t xml:space="preserve"> Phase Documents (6):</w:t>
             </w:r>
           </w:p>
         </w:tc>
@@ -725,13 +716,7 @@
           </w:p>
           <w:p>
             <w:r>
-              <w:t>Sprints (First Draft) (</w:t>
-            </w:r>
-            <w:r>
-              <w:t>3</w:t>
-            </w:r>
-            <w:r>
-              <w:t>)</w:t>
+              <w:t>Sprints (First Draft) (3)</w:t>
             </w:r>
           </w:p>
         </w:tc>
@@ -784,10 +769,26 @@
           </w:tcPr>
           <w:p>
             <w:r>
-              <w:t>Prototype</w:t>
-            </w:r>
-            <w:r>
-              <w:t xml:space="preserve"> (5-8)</w:t>
+              <w:t>Prototype (5-8):</w:t>
+            </w:r>
+            <w:r>
+              <w:br/>
+              <w:t>Project setup (2)</w:t>
+            </w:r>
+          </w:p>
+          <w:p>
+            <w:r>
+              <w:t>Database Set up (2)</w:t>
+            </w:r>
+          </w:p>
+          <w:p>
+            <w:r>
+              <w:t>API calls Defined (2)</w:t>
+            </w:r>
+          </w:p>
+          <w:p>
+            <w:r>
+              <w:t>Middleware Implemented. (2)</w:t>
             </w:r>
           </w:p>
         </w:tc>
@@ -798,6 +799,26 @@
           <w:p>
             <w:r>
               <w:t>Prototype.</w:t>
+            </w:r>
+          </w:p>
+          <w:p>
+            <w:r>
+              <w:t>Project Set up</w:t>
+            </w:r>
+          </w:p>
+          <w:p>
+            <w:r>
+              <w:t>Databases Set up</w:t>
+            </w:r>
+          </w:p>
+          <w:p>
+            <w:r>
+              <w:t>API calls.</w:t>
+            </w:r>
+          </w:p>
+          <w:p>
+            <w:r>
+              <w:t>Middleware Impl.</w:t>
             </w:r>
           </w:p>
         </w:tc>
@@ -835,10 +856,27 @@
           </w:tcPr>
           <w:p>
             <w:r>
-              <w:t>Design Presentation.</w:t>
-            </w:r>
-            <w:r>
-              <w:t xml:space="preserve"> (6)</w:t>
+              <w:t xml:space="preserve">Design Presentation </w:t>
+            </w:r>
+            <w:r>
+              <w:t>(6)</w:t>
+            </w:r>
+            <w:r>
+              <w:t xml:space="preserve"> : </w:t>
+            </w:r>
+          </w:p>
+          <w:p>
+            <w:r>
+              <w:t>Review Documents (2)</w:t>
+            </w:r>
+          </w:p>
+          <w:p>
+            <w:r>
+              <w:t>Create Presentation (3)</w:t>
+            </w:r>
+            <w:r>
+              <w:br/>
+              <w:t>Review Presentation (1)</w:t>
             </w:r>
           </w:p>
         </w:tc>
@@ -873,6 +911,12 @@
     <w:p/>
     <w:p>
       <w:r>
+        <w:br w:type="page"/>
+      </w:r>
+    </w:p>
+    <w:p>
+      <w:r>
+        <w:lastRenderedPageBreak/>
         <w:t>Risk Analysis</w:t>
       </w:r>
     </w:p>
@@ -1080,13 +1124,21 @@
           <w:tcPr>
             <w:tcW w:w="2383" w:type="dxa"/>
           </w:tcPr>
-          <w:p/>
+          <w:p>
+            <w:r>
+              <w:t>Save Project in external Repo and have backups</w:t>
+            </w:r>
+          </w:p>
         </w:tc>
         <w:tc>
           <w:tcPr>
             <w:tcW w:w="2976" w:type="dxa"/>
           </w:tcPr>
-          <w:p/>
+          <w:p>
+            <w:r>
+              <w:t>Recover project from repo and re-do lost work.</w:t>
+            </w:r>
+          </w:p>
         </w:tc>
       </w:tr>
       <w:tr>
@@ -1094,31 +1146,155 @@
           <w:tcPr>
             <w:tcW w:w="1803" w:type="dxa"/>
           </w:tcPr>
-          <w:p/>
+          <w:p>
+            <w:r>
+              <w:t>College Shutdown</w:t>
+            </w:r>
+          </w:p>
         </w:tc>
         <w:tc>
           <w:tcPr>
             <w:tcW w:w="1803" w:type="dxa"/>
           </w:tcPr>
-          <w:p/>
+          <w:p>
+            <w:r>
+              <w:t>Medium-high</w:t>
+            </w:r>
+          </w:p>
         </w:tc>
         <w:tc>
           <w:tcPr>
             <w:tcW w:w="1803" w:type="dxa"/>
           </w:tcPr>
-          <w:p/>
+          <w:p>
+            <w:r>
+              <w:t>low</w:t>
+            </w:r>
+          </w:p>
         </w:tc>
         <w:tc>
           <w:tcPr>
             <w:tcW w:w="2383" w:type="dxa"/>
           </w:tcPr>
-          <w:p/>
+          <w:p>
+            <w:r>
+              <w:t>Ensure working from home conditions are suitable</w:t>
+            </w:r>
+          </w:p>
         </w:tc>
         <w:tc>
           <w:tcPr>
             <w:tcW w:w="2976" w:type="dxa"/>
           </w:tcPr>
-          <w:p/>
+          <w:p>
+            <w:r>
+              <w:t>Ensure working from home conditions are suitable</w:t>
+            </w:r>
+          </w:p>
+        </w:tc>
+      </w:tr>
+      <w:tr>
+        <w:tc>
+          <w:tcPr>
+            <w:tcW w:w="1803" w:type="dxa"/>
+          </w:tcPr>
+          <w:p>
+            <w:r>
+              <w:t>Database API not suitable</w:t>
+            </w:r>
+          </w:p>
+        </w:tc>
+        <w:tc>
+          <w:tcPr>
+            <w:tcW w:w="1803" w:type="dxa"/>
+          </w:tcPr>
+          <w:p>
+            <w:r>
+              <w:t>Medium-high</w:t>
+            </w:r>
+          </w:p>
+        </w:tc>
+        <w:tc>
+          <w:tcPr>
+            <w:tcW w:w="1803" w:type="dxa"/>
+          </w:tcPr>
+          <w:p>
+            <w:r>
+              <w:t>Medium-low</w:t>
+            </w:r>
+          </w:p>
+        </w:tc>
+        <w:tc>
+          <w:tcPr>
+            <w:tcW w:w="2383" w:type="dxa"/>
+          </w:tcPr>
+          <w:p>
+            <w:r>
+              <w:t>Find suitable database systems that have the API requirements needed</w:t>
+            </w:r>
+          </w:p>
+        </w:tc>
+        <w:tc>
+          <w:tcPr>
+            <w:tcW w:w="2976" w:type="dxa"/>
+          </w:tcPr>
+          <w:p>
+            <w:r>
+              <w:t>Check Database systems for required Logs or Change reads.</w:t>
+            </w:r>
+          </w:p>
+        </w:tc>
+      </w:tr>
+      <w:tr>
+        <w:tc>
+          <w:tcPr>
+            <w:tcW w:w="1803" w:type="dxa"/>
+          </w:tcPr>
+          <w:p>
+            <w:r>
+              <w:t>Scope too large</w:t>
+            </w:r>
+          </w:p>
+        </w:tc>
+        <w:tc>
+          <w:tcPr>
+            <w:tcW w:w="1803" w:type="dxa"/>
+          </w:tcPr>
+          <w:p>
+            <w:r>
+              <w:t>Medium</w:t>
+            </w:r>
+          </w:p>
+        </w:tc>
+        <w:tc>
+          <w:tcPr>
+            <w:tcW w:w="1803" w:type="dxa"/>
+          </w:tcPr>
+          <w:p>
+            <w:r>
+              <w:t>Medium</w:t>
+            </w:r>
+          </w:p>
+        </w:tc>
+        <w:tc>
+          <w:tcPr>
+            <w:tcW w:w="2383" w:type="dxa"/>
+          </w:tcPr>
+          <w:p>
+            <w:r>
+              <w:t>Reduce Scope of project.</w:t>
+            </w:r>
+          </w:p>
+        </w:tc>
+        <w:tc>
+          <w:tcPr>
+            <w:tcW w:w="2976" w:type="dxa"/>
+          </w:tcPr>
+          <w:p>
+            <w:r>
+              <w:t>Define key scope requirements in user stories and preform backlog grooming.</w:t>
+            </w:r>
+          </w:p>
         </w:tc>
       </w:tr>
     </w:tbl>

</xml_diff>

<commit_message>
Final submission of Document, Presentation
</commit_message>
<xml_diff>
--- a/Project Plan & Risk Analysis.docx
+++ b/Project Plan & Risk Analysis.docx
@@ -482,22 +482,22 @@
           </w:tcPr>
           <w:p>
             <w:r>
-              <w:t>To Do</w:t>
-            </w:r>
-          </w:p>
-          <w:p>
-            <w:r>
-              <w:t>To Do</w:t>
-            </w:r>
-          </w:p>
-          <w:p>
-            <w:r>
-              <w:t>To Do</w:t>
-            </w:r>
-          </w:p>
-          <w:p>
-            <w:r>
-              <w:t>To Do</w:t>
+              <w:t>Done</w:t>
+            </w:r>
+          </w:p>
+          <w:p>
+            <w:r>
+              <w:t>Done</w:t>
+            </w:r>
+          </w:p>
+          <w:p>
+            <w:r>
+              <w:t>Done</w:t>
+            </w:r>
+          </w:p>
+          <w:p>
+            <w:r>
+              <w:t>Done</w:t>
             </w:r>
           </w:p>
         </w:tc>
@@ -507,10 +507,18 @@
           </w:tcPr>
           <w:p>
             <w:r>
-              <w:t xml:space="preserve">Chosen Jira, </w:t>
-            </w:r>
-            <w:r>
-              <w:t>and </w:t>
+              <w:t xml:space="preserve">Chosen </w:t>
+            </w:r>
+            <w:proofErr w:type="gramStart"/>
+            <w:r>
+              <w:t xml:space="preserve">Jira, </w:t>
+            </w:r>
+            <w:r>
+              <w:t>and</w:t>
+            </w:r>
+            <w:proofErr w:type="gramEnd"/>
+            <w:r>
+              <w:t> </w:t>
             </w:r>
             <w:r>
               <w:t>started to set up already.</w:t>
@@ -576,12 +584,12 @@
           </w:tcPr>
           <w:p>
             <w:r>
-              <w:t>To Do</w:t>
-            </w:r>
-          </w:p>
-          <w:p>
-            <w:r>
-              <w:t>To Do</w:t>
+              <w:t>Done</w:t>
+            </w:r>
+          </w:p>
+          <w:p>
+            <w:r>
+              <w:t>Done</w:t>
             </w:r>
           </w:p>
         </w:tc>
@@ -632,7 +640,7 @@
           </w:tcPr>
           <w:p>
             <w:r>
-              <w:t>To Do</w:t>
+              <w:t>Done</w:t>
             </w:r>
           </w:p>
         </w:tc>
@@ -683,7 +691,7 @@
           </w:tcPr>
           <w:p>
             <w:r>
-              <w:t>To Do</w:t>
+              <w:t>Done</w:t>
             </w:r>
           </w:p>
         </w:tc>
@@ -741,7 +749,7 @@
           </w:tcPr>
           <w:p>
             <w:r>
-              <w:t>To Do</w:t>
+              <w:t>Done</w:t>
             </w:r>
           </w:p>
         </w:tc>
@@ -818,7 +826,15 @@
           </w:p>
           <w:p>
             <w:r>
-              <w:t>Middleware Impl.</w:t>
+              <w:t xml:space="preserve">Middleware </w:t>
+            </w:r>
+            <w:proofErr w:type="spellStart"/>
+            <w:r>
+              <w:t>Impl</w:t>
+            </w:r>
+            <w:proofErr w:type="spellEnd"/>
+            <w:r>
+              <w:t>.</w:t>
             </w:r>
           </w:p>
         </w:tc>
@@ -828,7 +844,7 @@
           </w:tcPr>
           <w:p>
             <w:r>
-              <w:t>To Do</w:t>
+              <w:t>Done</w:t>
             </w:r>
           </w:p>
         </w:tc>
@@ -856,13 +872,15 @@
           </w:tcPr>
           <w:p>
             <w:r>
-              <w:t xml:space="preserve">Design Presentation </w:t>
-            </w:r>
-            <w:r>
-              <w:t>(6)</w:t>
-            </w:r>
-            <w:r>
-              <w:t xml:space="preserve"> : </w:t>
+              <w:t>Design Presentation (6</w:t>
+            </w:r>
+            <w:proofErr w:type="gramStart"/>
+            <w:r>
+              <w:t>) :</w:t>
+            </w:r>
+            <w:proofErr w:type="gramEnd"/>
+            <w:r>
+              <w:t xml:space="preserve"> </w:t>
             </w:r>
           </w:p>
           <w:p>

</xml_diff>